<commit_message>
CV graphique : remplacement par la version fournie (correction @LinkedIn tronqué + point superflu après 'compte-rendu')
</commit_message>
<xml_diff>
--- a/cv graphique/AIT_AMIR_Youssouf_Curriculum_Vitae_Graphique.docx
+++ b/cv graphique/AIT_AMIR_Youssouf_Curriculum_Vitae_Graphique.docx
@@ -118,11 +118,12 @@
             </w:pPr>
             <w:r>
               <w:rPr>
+                <w:rFonts w:ascii="DejaVu Sans" w:hAnsi="DejaVu Sans" w:cs="DejaVu Sans"/>
                 <w:color w:val="1CA3D6"/>
-                <w:sz w:val="15"/>
-                <w:szCs w:val="15"/>
-              </w:rPr>
-              <w:t xml:space="preserve">■ </w:t>
+                <w:sz w:val="20"/>
+                <w:szCs w:val="20"/>
+              </w:rPr>
+              <w:t xml:space="preserve">☎ </w:t>
             </w:r>
             <w:r>
               <w:rPr>
@@ -139,11 +140,12 @@
             </w:pPr>
             <w:r>
               <w:rPr>
+                <w:rFonts w:ascii="DejaVu Sans" w:hAnsi="DejaVu Sans" w:cs="DejaVu Sans"/>
                 <w:color w:val="1CA3D6"/>
-                <w:sz w:val="15"/>
-                <w:szCs w:val="15"/>
-              </w:rPr>
-              <w:t xml:space="preserve">■ </w:t>
+                <w:sz w:val="20"/>
+                <w:szCs w:val="20"/>
+              </w:rPr>
+              <w:t xml:space="preserve">✉ </w:t>
             </w:r>
             <w:r>
               <w:rPr>
@@ -160,11 +162,12 @@
             </w:pPr>
             <w:r>
               <w:rPr>
+                <w:rFonts w:ascii="DejaVu Sans" w:hAnsi="DejaVu Sans" w:cs="DejaVu Sans"/>
                 <w:color w:val="1CA3D6"/>
-                <w:sz w:val="15"/>
-                <w:szCs w:val="15"/>
-              </w:rPr>
-              <w:t xml:space="preserve">■ </w:t>
+                <w:sz w:val="20"/>
+                <w:szCs w:val="20"/>
+              </w:rPr>
+              <w:t xml:space="preserve">⌂ </w:t>
             </w:r>
             <w:r>
               <w:rPr>
@@ -181,11 +184,12 @@
             </w:pPr>
             <w:r>
               <w:rPr>
+                <w:rFonts w:ascii="DejaVu Sans" w:hAnsi="DejaVu Sans" w:cs="DejaVu Sans"/>
                 <w:color w:val="1CA3D6"/>
-                <w:sz w:val="15"/>
-                <w:szCs w:val="15"/>
-              </w:rPr>
-              <w:t xml:space="preserve">■ </w:t>
+                <w:sz w:val="20"/>
+                <w:szCs w:val="20"/>
+              </w:rPr>
+              <w:t xml:space="preserve">⚑ </w:t>
             </w:r>
             <w:r>
               <w:rPr>
@@ -194,6 +198,74 @@
                 <w:szCs w:val="18"/>
               </w:rPr>
               <w:t xml:space="preserve">Nationalité Française</w:t>
+            </w:r>
+          </w:p>
+          <w:p>
+            <w:pPr>
+              <w:spacing w:after="180" w:before="440"/>
+            </w:pPr>
+            <w:r>
+              <w:rPr>
+                <w:b/>
+                <w:bCs/>
+                <w:color w:val="FFFFFF"/>
+                <w:sz w:val="22"/>
+                <w:szCs w:val="22"/>
+              </w:rPr>
+              <w:t xml:space="preserve">RS</w:t>
+            </w:r>
+          </w:p>
+          <w:p>
+            <w:pPr>
+              <w:spacing w:after="90"/>
+            </w:pPr>
+            <w:r>
+              <w:drawing>
+                <wp:inline distT="0" distB="0" distL="0" distR="45720">
+                  <wp:extent cx="190500" cy="190500"/>
+                  <wp:effectExtent t="0" r="0" b="0" l="0"/>
+                  <wp:docPr id="20" name="linkedin-icon" descr="LinkedIn"/>
+                  <wp:cNvGraphicFramePr>
+                    <a:graphicFrameLocks xmlns:a="http://schemas.openxmlformats.org/drawingml/2006/main" noChangeAspect="1"/>
+                  </wp:cNvGraphicFramePr>
+                  <a:graphic xmlns:a="http://schemas.openxmlformats.org/drawingml/2006/main">
+                    <a:graphicData uri="http://schemas.openxmlformats.org/drawingml/2006/picture">
+                      <pic:pic xmlns:pic="http://schemas.openxmlformats.org/drawingml/2006/picture">
+                        <pic:nvPicPr>
+                          <pic:cNvPr id="20" name="linkedin-icon" descr="LinkedIn"/>
+                          <pic:cNvPicPr>
+                            <a:picLocks noChangeAspect="1"/>
+                          </pic:cNvPicPr>
+                        </pic:nvPicPr>
+                        <pic:blipFill>
+                          <a:blip r:embed="rId9" cstate="none"/>
+                          <a:srcRect/>
+                          <a:stretch>
+                            <a:fillRect/>
+                          </a:stretch>
+                        </pic:blipFill>
+                        <pic:spPr bwMode="auto">
+                          <a:xfrm>
+                            <a:off x="0" y="0"/>
+                            <a:ext cx="190500" cy="190500"/>
+                          </a:xfrm>
+                          <a:prstGeom prst="rect">
+                            <a:avLst/>
+                          </a:prstGeom>
+                        </pic:spPr>
+                      </pic:pic>
+                    </a:graphicData>
+                  </a:graphic>
+                </wp:inline>
+              </w:drawing>
+            </w:r>
+            <w:r>
+              <w:rPr>
+                <w:color w:val="FFFFFF"/>
+                <w:sz w:val="18"/>
+                <w:szCs w:val="18"/>
+              </w:rPr>
+              <w:t xml:space="preserve"> @youssouf-ait-amir-96b1132aa</w:t>
             </w:r>
           </w:p>
           <w:p>
@@ -565,19 +637,20 @@
                     <w:top w:type="dxa" w:w="40"/>
                     <w:left w:type="dxa" w:w="40"/>
                     <w:bottom w:type="dxa" w:w="0"/>
-                    <w:right w:type="dxa" w:w="40"/>
+                    <w:right w:type="dxa" w:w="0"/>
                   </w:tcMar>
                   <w:vAlign w:val="top"/>
                 </w:tcPr>
                 <w:p>
                   <w:pPr>
-                    <w:jc w:val="center"/>
-                  </w:pPr>
-                  <w:r>
-                    <w:rPr>
-                      <w:color w:val="1A1A1A"/>
-                      <w:sz w:val="16"/>
-                      <w:szCs w:val="16"/>
+                    <w:ind w:right="-90"/>
+                    <w:jc w:val="right"/>
+                  </w:pPr>
+                  <w:r>
+                    <w:rPr>
+                      <w:color w:val="1A1A1A"/>
+                      <w:sz w:val="26"/>
+                      <w:szCs w:val="26"/>
                     </w:rPr>
                     <w:t xml:space="preserve">●</w:t>
                   </w:r>
@@ -832,19 +905,20 @@
                     <w:top w:type="dxa" w:w="40"/>
                     <w:left w:type="dxa" w:w="40"/>
                     <w:bottom w:type="dxa" w:w="0"/>
-                    <w:right w:type="dxa" w:w="40"/>
+                    <w:right w:type="dxa" w:w="0"/>
                   </w:tcMar>
                   <w:vAlign w:val="top"/>
                 </w:tcPr>
                 <w:p>
                   <w:pPr>
-                    <w:jc w:val="center"/>
-                  </w:pPr>
-                  <w:r>
-                    <w:rPr>
-                      <w:color w:val="1A1A1A"/>
-                      <w:sz w:val="16"/>
-                      <w:szCs w:val="16"/>
+                    <w:ind w:right="-90"/>
+                    <w:jc w:val="right"/>
+                  </w:pPr>
+                  <w:r>
+                    <w:rPr>
+                      <w:color w:val="1A1A1A"/>
+                      <w:sz w:val="26"/>
+                      <w:szCs w:val="26"/>
                     </w:rPr>
                     <w:t xml:space="preserve">●</w:t>
                   </w:r>
@@ -967,19 +1041,20 @@
                     <w:top w:type="dxa" w:w="40"/>
                     <w:left w:type="dxa" w:w="40"/>
                     <w:bottom w:type="dxa" w:w="0"/>
-                    <w:right w:type="dxa" w:w="40"/>
+                    <w:right w:type="dxa" w:w="0"/>
                   </w:tcMar>
                   <w:vAlign w:val="top"/>
                 </w:tcPr>
                 <w:p>
                   <w:pPr>
-                    <w:jc w:val="center"/>
-                  </w:pPr>
-                  <w:r>
-                    <w:rPr>
-                      <w:color w:val="1A1A1A"/>
-                      <w:sz w:val="16"/>
-                      <w:szCs w:val="16"/>
+                    <w:ind w:right="-90"/>
+                    <w:jc w:val="right"/>
+                  </w:pPr>
+                  <w:r>
+                    <w:rPr>
+                      <w:color w:val="1A1A1A"/>
+                      <w:sz w:val="26"/>
+                      <w:szCs w:val="26"/>
                     </w:rPr>
                     <w:t xml:space="preserve">●</w:t>
                   </w:r>
@@ -1094,19 +1169,20 @@
                     <w:top w:type="dxa" w:w="40"/>
                     <w:left w:type="dxa" w:w="40"/>
                     <w:bottom w:type="dxa" w:w="0"/>
-                    <w:right w:type="dxa" w:w="40"/>
+                    <w:right w:type="dxa" w:w="0"/>
                   </w:tcMar>
                   <w:vAlign w:val="top"/>
                 </w:tcPr>
                 <w:p>
                   <w:pPr>
-                    <w:jc w:val="center"/>
-                  </w:pPr>
-                  <w:r>
-                    <w:rPr>
-                      <w:color w:val="1A1A1A"/>
-                      <w:sz w:val="16"/>
-                      <w:szCs w:val="16"/>
+                    <w:ind w:right="-90"/>
+                    <w:jc w:val="right"/>
+                  </w:pPr>
+                  <w:r>
+                    <w:rPr>
+                      <w:color w:val="1A1A1A"/>
+                      <w:sz w:val="26"/>
+                      <w:szCs w:val="26"/>
                     </w:rPr>
                     <w:t xml:space="preserve">●</w:t>
                   </w:r>
@@ -1232,7 +1308,7 @@
                       <w:sz w:val="19"/>
                       <w:szCs w:val="19"/>
                     </w:rPr>
-                    <w:t xml:space="preserve">Renforcement de la sécurité du protocole de supervision réseau (SNMP) sur le site du client, avec compte-rendu.</w:t>
+                    <w:t xml:space="preserve">Renforcement de la sécurité du protocole de supervision réseau (SNMP) sur le site du client, avec compte-rendu</w:t>
                   </w:r>
                 </w:p>
                 <w:p>

</xml_diff>

<commit_message>
Remplacement du CV graphique par la nouvelle version
</commit_message>
<xml_diff>
--- a/cv graphique/AIT_AMIR_Youssouf_Curriculum_Vitae_Graphique.docx
+++ b/cv graphique/AIT_AMIR_Youssouf_Curriculum_Vitae_Graphique.docx
@@ -59,22 +59,22 @@
             </w:tcBorders>
             <w:shd w:fill="333333" w:color="auto" w:val="clear"/>
             <w:tcMar>
-              <w:top w:type="dxa" w:w="500"/>
+              <w:top w:type="dxa" w:w="280"/>
               <w:left w:type="dxa" w:w="360"/>
-              <w:bottom w:type="dxa" w:w="500"/>
+              <w:bottom w:type="dxa" w:w="300"/>
               <w:right w:type="dxa" w:w="360"/>
             </w:tcMar>
             <w:vAlign w:val="top"/>
           </w:tcPr>
           <w:p>
             <w:pPr>
-              <w:spacing w:after="260"/>
+              <w:spacing w:after="180"/>
               <w:jc w:val="center"/>
             </w:pPr>
             <w:r>
               <w:drawing>
                 <wp:inline distT="0" distB="0" distL="0" distR="0">
-                  <wp:extent cx="1257300" cy="1257300"/>
+                  <wp:extent cx="1120140" cy="1120140"/>
                   <wp:effectExtent t="0" r="0" b="0" l="0"/>
                   <wp:docPr id="1" name="" descr="" title=""/>
                   <wp:cNvGraphicFramePr>
@@ -114,95 +114,228 @@
           </w:p>
           <w:p>
             <w:pPr>
-              <w:spacing w:after="90"/>
-            </w:pPr>
-            <w:r>
-              <w:rPr>
-                <w:rFonts w:ascii="DejaVu Sans" w:hAnsi="DejaVu Sans" w:cs="DejaVu Sans"/>
-                <w:color w:val="1CA3D6"/>
-                <w:sz w:val="20"/>
-                <w:szCs w:val="20"/>
-              </w:rPr>
-              <w:t xml:space="preserve">☎ </w:t>
+              <w:spacing w:after="65"/>
+            </w:pPr>
+            <w:r>
+              <w:drawing>
+                <wp:inline distT="0" distB="0" distL="0" distR="45720">
+                  <wp:extent cx="190500" cy="190500"/>
+                  <wp:effectExtent t="0" r="0" b="0" l="0"/>
+                  <wp:docPr id="21" name="phone-icon" descr="phone-icon"/>
+                  <wp:cNvGraphicFramePr>
+                    <a:graphicFrameLocks xmlns:a="http://schemas.openxmlformats.org/drawingml/2006/main" noChangeAspect="1"/>
+                  </wp:cNvGraphicFramePr>
+                  <a:graphic xmlns:a="http://schemas.openxmlformats.org/drawingml/2006/main">
+                    <a:graphicData uri="http://schemas.openxmlformats.org/drawingml/2006/picture">
+                      <pic:pic xmlns:pic="http://schemas.openxmlformats.org/drawingml/2006/picture">
+                        <pic:nvPicPr>
+                          <pic:cNvPr id="21" name="phone-icon" descr="phone-icon"/>
+                          <pic:cNvPicPr>
+                            <a:picLocks noChangeAspect="1"/>
+                          </pic:cNvPicPr>
+                        </pic:nvPicPr>
+                        <pic:blipFill>
+                          <a:blip r:embed="rId10" cstate="none"/>
+                          <a:srcRect/>
+                          <a:stretch>
+                            <a:fillRect/>
+                          </a:stretch>
+                        </pic:blipFill>
+                        <pic:spPr bwMode="auto">
+                          <a:xfrm>
+                            <a:off x="0" y="0"/>
+                            <a:ext cx="190500" cy="190500"/>
+                          </a:xfrm>
+                          <a:prstGeom prst="rect">
+                            <a:avLst/>
+                          </a:prstGeom>
+                        </pic:spPr>
+                      </pic:pic>
+                    </a:graphicData>
+                  </a:graphic>
+                </wp:inline>
+              </w:drawing>
+            </w:r>
+            <w:hyperlink r:id="rId19" w:history="1">
+              <w:r>
+                <w:rPr>
+                  <w:color w:val="FFFFFF"/>
+                  <w:sz w:val="18"/>
+                  <w:szCs w:val="18"/>
+                  <w:position w:val="6"/>
+                </w:rPr>
+                <w:t xml:space="preserve">07 80 75 07 19</w:t>
+              </w:r>
+            </w:hyperlink>
+          </w:p>
+          <w:p>
+            <w:pPr>
+              <w:spacing w:after="65"/>
+            </w:pPr>
+            <w:r>
+              <w:drawing>
+                <wp:inline distT="0" distB="0" distL="0" distR="45720">
+                  <wp:extent cx="190500" cy="190500"/>
+                  <wp:effectExtent t="0" r="0" b="0" l="0"/>
+                  <wp:docPr id="22" name="mail-icon" descr="mail-icon"/>
+                  <wp:cNvGraphicFramePr>
+                    <a:graphicFrameLocks xmlns:a="http://schemas.openxmlformats.org/drawingml/2006/main" noChangeAspect="1"/>
+                  </wp:cNvGraphicFramePr>
+                  <a:graphic xmlns:a="http://schemas.openxmlformats.org/drawingml/2006/main">
+                    <a:graphicData uri="http://schemas.openxmlformats.org/drawingml/2006/picture">
+                      <pic:pic xmlns:pic="http://schemas.openxmlformats.org/drawingml/2006/picture">
+                        <pic:nvPicPr>
+                          <pic:cNvPr id="22" name="mail-icon" descr="mail-icon"/>
+                          <pic:cNvPicPr>
+                            <a:picLocks noChangeAspect="1"/>
+                          </pic:cNvPicPr>
+                        </pic:nvPicPr>
+                        <pic:blipFill>
+                          <a:blip r:embed="rId11" cstate="none"/>
+                          <a:srcRect/>
+                          <a:stretch>
+                            <a:fillRect/>
+                          </a:stretch>
+                        </pic:blipFill>
+                        <pic:spPr bwMode="auto">
+                          <a:xfrm>
+                            <a:off x="0" y="0"/>
+                            <a:ext cx="190500" cy="190500"/>
+                          </a:xfrm>
+                          <a:prstGeom prst="rect">
+                            <a:avLst/>
+                          </a:prstGeom>
+                        </pic:spPr>
+                      </pic:pic>
+                    </a:graphicData>
+                  </a:graphic>
+                </wp:inline>
+              </w:drawing>
+            </w:r>
+            <w:hyperlink r:id="rId20" w:history="1">
+              <w:r>
+                <w:rPr>
+                  <w:color w:val="FFFFFF"/>
+                  <w:sz w:val="18"/>
+                  <w:szCs w:val="18"/>
+                  <w:position w:val="6"/>
+                </w:rPr>
+                <w:t xml:space="preserve">youssouf.tzvn@gmail.com</w:t>
+              </w:r>
+            </w:hyperlink>
+          </w:p>
+          <w:p>
+            <w:pPr>
+              <w:spacing w:after="65"/>
+            </w:pPr>
+            <w:r>
+              <w:drawing>
+                <wp:inline distT="0" distB="0" distL="0" distR="45720">
+                  <wp:extent cx="190500" cy="190500"/>
+                  <wp:effectExtent t="0" r="0" b="0" l="0"/>
+                  <wp:docPr id="23" name="location-icon" descr="location-icon"/>
+                  <wp:cNvGraphicFramePr>
+                    <a:graphicFrameLocks xmlns:a="http://schemas.openxmlformats.org/drawingml/2006/main" noChangeAspect="1"/>
+                  </wp:cNvGraphicFramePr>
+                  <a:graphic xmlns:a="http://schemas.openxmlformats.org/drawingml/2006/main">
+                    <a:graphicData uri="http://schemas.openxmlformats.org/drawingml/2006/picture">
+                      <pic:pic xmlns:pic="http://schemas.openxmlformats.org/drawingml/2006/picture">
+                        <pic:nvPicPr>
+                          <pic:cNvPr id="23" name="location-icon" descr="location-icon"/>
+                          <pic:cNvPicPr>
+                            <a:picLocks noChangeAspect="1"/>
+                          </pic:cNvPicPr>
+                        </pic:nvPicPr>
+                        <pic:blipFill>
+                          <a:blip r:embed="rId12" cstate="none"/>
+                          <a:srcRect/>
+                          <a:stretch>
+                            <a:fillRect/>
+                          </a:stretch>
+                        </pic:blipFill>
+                        <pic:spPr bwMode="auto">
+                          <a:xfrm>
+                            <a:off x="0" y="0"/>
+                            <a:ext cx="190500" cy="190500"/>
+                          </a:xfrm>
+                          <a:prstGeom prst="rect">
+                            <a:avLst/>
+                          </a:prstGeom>
+                        </pic:spPr>
+                      </pic:pic>
+                    </a:graphicData>
+                  </a:graphic>
+                </wp:inline>
+              </w:drawing>
             </w:r>
             <w:r>
               <w:rPr>
                 <w:color w:val="FFFFFF"/>
                 <w:sz w:val="18"/>
                 <w:szCs w:val="18"/>
-              </w:rPr>
-              <w:t xml:space="preserve">07 80 75 07 19</w:t>
-            </w:r>
-          </w:p>
-          <w:p>
-            <w:pPr>
-              <w:spacing w:after="90"/>
-            </w:pPr>
-            <w:r>
-              <w:rPr>
-                <w:rFonts w:ascii="DejaVu Sans" w:hAnsi="DejaVu Sans" w:cs="DejaVu Sans"/>
-                <w:color w:val="1CA3D6"/>
-                <w:sz w:val="20"/>
-                <w:szCs w:val="20"/>
-              </w:rPr>
-              <w:t xml:space="preserve">✉ </w:t>
+                <w:position w:val="6"/>
+              </w:rPr>
+              <w:t xml:space="preserve">Lille (59)</w:t>
+            </w:r>
+          </w:p>
+          <w:p>
+            <w:pPr>
+              <w:spacing w:after="65"/>
+            </w:pPr>
+            <w:r>
+              <w:drawing>
+                <wp:inline distT="0" distB="0" distL="0" distR="45720">
+                  <wp:extent cx="190500" cy="190500"/>
+                  <wp:effectExtent t="0" r="0" b="0" l="0"/>
+                  <wp:docPr id="24" name="flag-icon" descr="flag-icon"/>
+                  <wp:cNvGraphicFramePr>
+                    <a:graphicFrameLocks xmlns:a="http://schemas.openxmlformats.org/drawingml/2006/main" noChangeAspect="1"/>
+                  </wp:cNvGraphicFramePr>
+                  <a:graphic xmlns:a="http://schemas.openxmlformats.org/drawingml/2006/main">
+                    <a:graphicData uri="http://schemas.openxmlformats.org/drawingml/2006/picture">
+                      <pic:pic xmlns:pic="http://schemas.openxmlformats.org/drawingml/2006/picture">
+                        <pic:nvPicPr>
+                          <pic:cNvPr id="24" name="flag-icon" descr="flag-icon"/>
+                          <pic:cNvPicPr>
+                            <a:picLocks noChangeAspect="1"/>
+                          </pic:cNvPicPr>
+                        </pic:nvPicPr>
+                        <pic:blipFill>
+                          <a:blip r:embed="rId13" cstate="none"/>
+                          <a:srcRect/>
+                          <a:stretch>
+                            <a:fillRect/>
+                          </a:stretch>
+                        </pic:blipFill>
+                        <pic:spPr bwMode="auto">
+                          <a:xfrm>
+                            <a:off x="0" y="0"/>
+                            <a:ext cx="190500" cy="190500"/>
+                          </a:xfrm>
+                          <a:prstGeom prst="rect">
+                            <a:avLst/>
+                          </a:prstGeom>
+                        </pic:spPr>
+                      </pic:pic>
+                    </a:graphicData>
+                  </a:graphic>
+                </wp:inline>
+              </w:drawing>
             </w:r>
             <w:r>
               <w:rPr>
                 <w:color w:val="FFFFFF"/>
                 <w:sz w:val="18"/>
                 <w:szCs w:val="18"/>
-              </w:rPr>
-              <w:t xml:space="preserve">youssouf.tzvn@gmail.com</w:t>
-            </w:r>
-          </w:p>
-          <w:p>
-            <w:pPr>
-              <w:spacing w:after="90"/>
-            </w:pPr>
-            <w:r>
-              <w:rPr>
-                <w:rFonts w:ascii="DejaVu Sans" w:hAnsi="DejaVu Sans" w:cs="DejaVu Sans"/>
-                <w:color w:val="1CA3D6"/>
-                <w:sz w:val="20"/>
-                <w:szCs w:val="20"/>
-              </w:rPr>
-              <w:t xml:space="preserve">⌂ </w:t>
-            </w:r>
-            <w:r>
-              <w:rPr>
-                <w:color w:val="FFFFFF"/>
-                <w:sz w:val="18"/>
-                <w:szCs w:val="18"/>
-              </w:rPr>
-              <w:t xml:space="preserve">Lille (59)</w:t>
-            </w:r>
-          </w:p>
-          <w:p>
-            <w:pPr>
-              <w:spacing w:after="90"/>
-            </w:pPr>
-            <w:r>
-              <w:rPr>
-                <w:rFonts w:ascii="DejaVu Sans" w:hAnsi="DejaVu Sans" w:cs="DejaVu Sans"/>
-                <w:color w:val="1CA3D6"/>
-                <w:sz w:val="20"/>
-                <w:szCs w:val="20"/>
-              </w:rPr>
-              <w:t xml:space="preserve">⚑ </w:t>
-            </w:r>
-            <w:r>
-              <w:rPr>
-                <w:color w:val="FFFFFF"/>
-                <w:sz w:val="18"/>
-                <w:szCs w:val="18"/>
+                <w:position w:val="6"/>
               </w:rPr>
               <w:t xml:space="preserve">Nationalité Française</w:t>
             </w:r>
           </w:p>
           <w:p>
             <w:pPr>
-              <w:spacing w:after="180" w:before="440"/>
+              <w:spacing w:after="140" w:before="240"/>
+              <w:jc w:val="center"/>
             </w:pPr>
             <w:r>
               <w:rPr>
@@ -217,7 +350,8 @@
           </w:p>
           <w:p>
             <w:pPr>
-              <w:spacing w:after="90"/>
+              <w:spacing w:after="65"/>
+              <w:jc w:val="center"/>
             </w:pPr>
             <w:r>
               <w:drawing>
@@ -264,13 +398,15 @@
                 <w:color w:val="FFFFFF"/>
                 <w:sz w:val="18"/>
                 <w:szCs w:val="18"/>
+                <w:position w:val="6"/>
               </w:rPr>
               <w:t xml:space="preserve"> @youssouf-ait-amir</w:t>
             </w:r>
           </w:p>
           <w:p>
             <w:pPr>
-              <w:spacing w:after="180" w:before="440"/>
+              <w:spacing w:after="140" w:before="240"/>
+              <w:jc w:val="center"/>
             </w:pPr>
             <w:r>
               <w:rPr>
@@ -279,6 +415,82 @@
                 <w:color w:val="FFFFFF"/>
                 <w:sz w:val="22"/>
                 <w:szCs w:val="22"/>
+                <w:u w:val="single"/>
+              </w:rPr>
+              <w:t xml:space="preserve">PORTFOLIO</w:t>
+            </w:r>
+          </w:p>
+          <w:p>
+            <w:pPr>
+              <w:spacing w:after="80"/>
+              <w:jc w:val="center"/>
+            </w:pPr>
+            <w:r>
+              <w:drawing>
+                <wp:inline distT="0" distB="0" distL="0" distR="0">
+                  <wp:extent cx="1028700" cy="1028700"/>
+                  <wp:effectExtent t="0" r="0" b="0" l="0"/>
+                  <wp:docPr id="30" name="qr-portfolio" descr="QR code portfolio"/>
+                  <wp:cNvGraphicFramePr>
+                    <a:graphicFrameLocks xmlns:a="http://schemas.openxmlformats.org/drawingml/2006/main" noChangeAspect="1"/>
+                  </wp:cNvGraphicFramePr>
+                  <a:graphic xmlns:a="http://schemas.openxmlformats.org/drawingml/2006/main">
+                    <a:graphicData uri="http://schemas.openxmlformats.org/drawingml/2006/picture">
+                      <pic:pic xmlns:pic="http://schemas.openxmlformats.org/drawingml/2006/picture">
+                        <pic:nvPicPr>
+                          <pic:cNvPr id="30" name="qr-portfolio" descr="QR code portfolio"/>
+                          <pic:cNvPicPr>
+                            <a:picLocks noChangeAspect="1"/>
+                          </pic:cNvPicPr>
+                        </pic:nvPicPr>
+                        <pic:blipFill>
+                          <a:blip r:embed="rId14" cstate="none"/>
+                          <a:srcRect/>
+                          <a:stretch>
+                            <a:fillRect/>
+                          </a:stretch>
+                        </pic:blipFill>
+                        <pic:spPr bwMode="auto">
+                          <a:xfrm>
+                            <a:off x="0" y="0"/>
+                            <a:ext cx="1028700" cy="1028700"/>
+                          </a:xfrm>
+                          <a:prstGeom prst="rect">
+                            <a:avLst/>
+                          </a:prstGeom>
+                        </pic:spPr>
+                      </pic:pic>
+                    </a:graphicData>
+                  </a:graphic>
+                </wp:inline>
+              </w:drawing>
+            </w:r>
+          </w:p>
+          <w:p>
+            <w:pPr>
+              <w:spacing w:after="40"/>
+              <w:jc w:val="center"/>
+            </w:pPr>
+            <w:r>
+              <w:rPr>
+                <w:color w:val="1CA3D6"/>
+                <w:sz w:val="19"/>
+                <w:szCs w:val="19"/>
+              </w:rPr>
+              <w:t xml:space="preserve">https://ait-amir-youssouf-pf.vercel.app</w:t>
+            </w:r>
+          </w:p>
+          <w:p>
+            <w:pPr>
+              <w:spacing w:after="140" w:before="240"/>
+            </w:pPr>
+            <w:r>
+              <w:rPr>
+                <w:b/>
+                <w:bCs/>
+                <w:color w:val="FFFFFF"/>
+                <w:sz w:val="22"/>
+                <w:szCs w:val="22"/>
               </w:rPr>
               <w:t xml:space="preserve">LANGUES</w:t>
             </w:r>
@@ -300,7 +512,7 @@
           </w:p>
           <w:p>
             <w:pPr>
-              <w:spacing w:after="220"/>
+              <w:spacing w:after="130"/>
             </w:pPr>
             <w:r>
               <w:rPr>
@@ -308,7 +520,7 @@
                 <w:sz w:val="17"/>
                 <w:szCs w:val="17"/>
               </w:rPr>
-              <w:t xml:space="preserve">B1 certifié</w:t>
+              <w:t xml:space="preserve">B1</w:t>
             </w:r>
           </w:p>
           <w:p>
@@ -328,7 +540,7 @@
           </w:p>
           <w:p>
             <w:pPr>
-              <w:spacing w:after="220"/>
+              <w:spacing w:after="130"/>
             </w:pPr>
             <w:r>
               <w:rPr>
@@ -336,12 +548,12 @@
                 <w:sz w:val="17"/>
                 <w:szCs w:val="17"/>
               </w:rPr>
-              <w:t xml:space="preserve">A2+ certifié</w:t>
-            </w:r>
-          </w:p>
-          <w:p>
-            <w:pPr>
-              <w:spacing w:after="180" w:before="440"/>
+              <w:t xml:space="preserve">A2+</w:t>
+            </w:r>
+          </w:p>
+          <w:p>
+            <w:pPr>
+              <w:spacing w:after="140" w:before="240"/>
             </w:pPr>
             <w:r>
               <w:rPr>
@@ -371,7 +583,7 @@
           </w:p>
           <w:p>
             <w:pPr>
-              <w:spacing w:after="220"/>
+              <w:spacing w:after="130"/>
             </w:pPr>
             <w:r>
               <w:rPr>
@@ -399,7 +611,7 @@
           </w:p>
           <w:p>
             <w:pPr>
-              <w:spacing w:after="220"/>
+              <w:spacing w:after="130"/>
             </w:pPr>
             <w:r>
               <w:rPr>
@@ -427,7 +639,7 @@
           </w:p>
           <w:p>
             <w:pPr>
-              <w:spacing w:after="220"/>
+              <w:spacing w:after="130"/>
             </w:pPr>
             <w:r>
               <w:rPr>
@@ -455,7 +667,7 @@
           </w:p>
           <w:p>
             <w:pPr>
-              <w:spacing w:after="220"/>
+              <w:spacing w:after="130"/>
             </w:pPr>
             <w:r>
               <w:rPr>
@@ -468,7 +680,7 @@
           </w:p>
           <w:p>
             <w:pPr>
-              <w:spacing w:after="180" w:before="440"/>
+              <w:spacing w:after="140" w:before="240"/>
             </w:pPr>
             <w:r>
               <w:rPr>
@@ -498,7 +710,7 @@
           </w:p>
           <w:p>
             <w:pPr>
-              <w:spacing w:after="220"/>
+              <w:spacing w:after="130"/>
             </w:pPr>
             <w:r>
               <w:rPr>
@@ -585,25 +797,79 @@
                 <w:sz w:val="23"/>
                 <w:szCs w:val="23"/>
               </w:rPr>
-              <w:t xml:space="preserve">BTS Cybersécurité Informatique et Électronique — Option Électronique et Réseaux</w:t>
+              <w:t xml:space="preserve">Étudiant en informatique</w:t>
+              <w:br/>
+              <w:t xml:space="preserve">Titulaire du BTS Cybersécurité Informatique et Électronique</w:t>
+              <w:br/>
+              <w:t xml:space="preserve">Option Électronique et Réseaux</w:t>
             </w:r>
           </w:p>
           <w:p>
             <w:pPr>
               <w:pBdr>
-                <w:bottom w:val="single" w:color="1CA3D6" w:sz="4" w:space="4"/>
+                <w:bottom w:val="single" w:color="1F3F52" w:sz="4" w:space="4"/>
               </w:pBdr>
-              <w:spacing w:after="200" w:before="380"/>
-            </w:pPr>
+              <w:spacing w:after="100" w:before="0"/>
+            </w:pPr>
+            <w:r>
+              <w:rPr>
+                <w:position w:val="6"/>
+              </w:rPr>
+              <w:drawing>
+                <wp:inline distT="0" distB="0" distL="0" distR="55000">
+                  <wp:extent cx="165000" cy="165000"/>
+                  <wp:effectExtent t="0" r="0" b="0" l="0"/>
+                  <wp:docPr id="43" name="profil-icon" descr="profil-icon"/>
+                  <wp:cNvGraphicFramePr>
+                    <a:graphicFrameLocks xmlns:a="http://schemas.openxmlformats.org/drawingml/2006/main" noChangeAspect="1"/>
+                  </wp:cNvGraphicFramePr>
+                  <a:graphic xmlns:a="http://schemas.openxmlformats.org/drawingml/2006/main">
+                    <a:graphicData uri="http://schemas.openxmlformats.org/drawingml/2006/picture">
+                      <pic:pic xmlns:pic="http://schemas.openxmlformats.org/drawingml/2006/picture">
+                        <pic:nvPicPr>
+                          <pic:cNvPr id="43" name="profil-icon" descr="profil-icon"/>
+                          <pic:cNvPicPr>
+                            <a:picLocks noChangeAspect="1"/>
+                          </pic:cNvPicPr>
+                        </pic:nvPicPr>
+                        <pic:blipFill>
+                          <a:blip r:embed="rId15" cstate="none"/>
+                          <a:srcRect/>
+                          <a:stretch>
+                            <a:fillRect/>
+                          </a:stretch>
+                        </pic:blipFill>
+                        <pic:spPr bwMode="auto">
+                          <a:xfrm>
+                            <a:off x="0" y="0"/>
+                            <a:ext cx="165000" cy="165000"/>
+                          </a:xfrm>
+                          <a:prstGeom prst="rect">
+                            <a:avLst/>
+                          </a:prstGeom>
+                        </pic:spPr>
+                      </pic:pic>
+                    </a:graphicData>
+                  </a:graphic>
+                </wp:inline>
+              </w:drawing>
+            </w:r>
+            <w:r>
+              <w:rPr>
+                <w:sz w:val="26"/>
+                <w:szCs w:val="26"/>
+              </w:rPr>
+              <w:t xml:space="preserve"> </w:t>
+            </w:r>
             <w:r>
               <w:rPr>
                 <w:b/>
                 <w:bCs/>
-                <w:color w:val="1CA3D6"/>
+                <w:color w:val="1F3F52"/>
                 <w:sz w:val="26"/>
                 <w:szCs w:val="26"/>
               </w:rPr>
-              <w:t xml:space="preserve">FORMATION</w:t>
+              <w:t xml:space="preserve">PROFIL</w:t>
             </w:r>
           </w:p>
           <w:tbl>
@@ -643,16 +909,50 @@
                 </w:tcPr>
                 <w:p>
                   <w:pPr>
-                    <w:ind w:right="-90"/>
-                    <w:jc w:val="right"/>
-                  </w:pPr>
-                  <w:r>
-                    <w:rPr>
-                      <w:color w:val="1A1A1A"/>
-                      <w:sz w:val="26"/>
-                      <w:szCs w:val="26"/>
-                    </w:rPr>
-                    <w:t xml:space="preserve">●</w:t>
+                    <w:spacing w:after="0"/>
+                  </w:pPr>
+                  <w:r>
+                    <w:drawing>
+                      <wp:anchor distT="0" distB="0" distL="0" distR="0" simplePos="0" relativeHeight="251658240" behindDoc="0" locked="0" layoutInCell="1" allowOverlap="1">
+                        <wp:simplePos x="0" y="0"/>
+                        <wp:positionH relativeFrom="column">
+                          <wp:posOffset>173900</wp:posOffset>
+                        </wp:positionH>
+                        <wp:positionV relativeFrom="paragraph">
+                          <wp:posOffset>55000</wp:posOffset>
+                        </wp:positionV>
+                        <wp:extent cx="84000" cy="84000"/>
+                        <wp:effectExtent l="0" t="0" r="0" b="0"/>
+                        <wp:wrapNone/>
+                        <wp:docPr id="100" name="puce-0" descr="puce"/>
+                        <wp:cNvGraphicFramePr/>
+                        <a:graphic xmlns:a="http://schemas.openxmlformats.org/drawingml/2006/main">
+                          <a:graphicData uri="http://schemas.openxmlformats.org/drawingml/2006/picture">
+                            <pic:pic xmlns:pic="http://schemas.openxmlformats.org/drawingml/2006/picture">
+                              <pic:nvPicPr>
+                                <pic:cNvPr id="100" name="puce-0"/>
+                                <pic:cNvPicPr/>
+                              </pic:nvPicPr>
+                              <pic:blipFill>
+                                <a:blip r:embed="rId18"/>
+                                <a:stretch>
+                                  <a:fillRect/>
+                                </a:stretch>
+                              </pic:blipFill>
+                              <pic:spPr>
+                                <a:xfrm>
+                                  <a:off x="0" y="0"/>
+                                  <a:ext cx="84000" cy="84000"/>
+                                </a:xfrm>
+                                <a:prstGeom prst="rect">
+                                  <a:avLst/>
+                                </a:prstGeom>
+                              </pic:spPr>
+                            </pic:pic>
+                          </a:graphicData>
+                        </a:graphic>
+                      </wp:anchor>
+                    </w:drawing>
                   </w:r>
                 </w:p>
               </w:tc>
@@ -675,446 +975,18 @@
                 </w:tcPr>
                 <w:p>
                   <w:pPr>
-                    <w:spacing w:after="60" w:line="300"/>
-                  </w:pPr>
-                  <w:r>
-                    <w:rPr>
-                      <w:b/>
-                      <w:bCs/>
-                      <w:color w:val="1A1A1A"/>
-                      <w:sz w:val="22"/>
-                      <w:szCs w:val="22"/>
-                    </w:rPr>
-                    <w:t xml:space="preserve">BTS Cybersécurité informatique et Electronique — Option B : Électronique et Réseaux</w:t>
-                  </w:r>
+                    <w:spacing w:after="0" w:line="255"/>
+                    <w:ind w:right="300"/>
+                  </w:pPr>
                   <w:r>
                     <w:rPr>
                       <w:i/>
                       <w:iCs/>
-                      <w:color w:val="999999"/>
-                      <w:sz w:val="19"/>
-                      <w:szCs w:val="19"/>
-                    </w:rPr>
-                    <w:t xml:space="preserve">   2024 – 2026</w:t>
-                  </w:r>
-                </w:p>
-                <w:p>
-                  <w:pPr>
-                    <w:spacing w:after="140"/>
-                  </w:pPr>
-                  <w:r>
-                    <w:rPr>
-                      <w:i/>
-                      <w:iCs/>
-                      <w:color w:val="4A7B93"/>
-                      <w:sz w:val="20"/>
-                      <w:szCs w:val="20"/>
-                    </w:rPr>
-                    <w:t xml:space="preserve">LGT Baggio, Lille (59)</w:t>
-                  </w:r>
-                </w:p>
-                <w:p>
-                  <w:pPr>
-                    <w:spacing w:after="70" w:line="280"/>
-                    <w:ind w:left="160"/>
-                  </w:pPr>
-                  <w:r>
-                    <w:rPr>
-                      <w:color w:val="4A7B93"/>
-                      <w:sz w:val="19"/>
-                      <w:szCs w:val="19"/>
-                    </w:rPr>
-                    <w:t xml:space="preserve">▸ </w:t>
-                  </w:r>
-                  <w:r>
-                    <w:rPr>
                       <w:color w:val="1A1A1A"/>
                       <w:sz w:val="19"/>
                       <w:szCs w:val="19"/>
                     </w:rPr>
-                    <w:t xml:space="preserve">Formation exigeant rigueur, méthode et respect des procédures</w:t>
-                  </w:r>
-                </w:p>
-                <w:p>
-                  <w:pPr>
-                    <w:spacing w:after="70" w:line="280"/>
-                    <w:ind w:left="160"/>
-                  </w:pPr>
-                  <w:r>
-                    <w:rPr>
-                      <w:color w:val="4A7B93"/>
-                      <w:sz w:val="19"/>
-                      <w:szCs w:val="19"/>
-                    </w:rPr>
-                    <w:t xml:space="preserve">▸ </w:t>
-                  </w:r>
-                  <w:r>
-                    <w:rPr>
-                      <w:color w:val="1A1A1A"/>
-                      <w:sz w:val="19"/>
-                      <w:szCs w:val="19"/>
-                    </w:rPr>
-                    <w:t xml:space="preserve">Développement de l'autonomie, du travail en équipe et de la capacité d'analyse</w:t>
-                  </w:r>
-                </w:p>
-                <w:p>
-                  <w:pPr>
-                    <w:spacing w:after="70" w:line="280"/>
-                    <w:ind w:left="160"/>
-                  </w:pPr>
-                  <w:r>
-                    <w:rPr>
-                      <w:color w:val="4A7B93"/>
-                      <w:sz w:val="19"/>
-                      <w:szCs w:val="19"/>
-                    </w:rPr>
-                    <w:t xml:space="preserve">▸ </w:t>
-                  </w:r>
-                  <w:r>
-                    <w:rPr>
-                      <w:color w:val="1A1A1A"/>
-                      <w:sz w:val="19"/>
-                      <w:szCs w:val="19"/>
-                    </w:rPr>
-                    <w:t xml:space="preserve">Compétences informatiques : systèmes, réseaux et programmation (Zabbix, Wireshark)</w:t>
-                  </w:r>
-                </w:p>
-                <w:p>
-                  <w:pPr>
-                    <w:spacing w:after="70" w:line="280"/>
-                    <w:ind w:left="160"/>
-                  </w:pPr>
-                  <w:r>
-                    <w:rPr>
-                      <w:color w:val="4A7B93"/>
-                      <w:sz w:val="19"/>
-                      <w:szCs w:val="19"/>
-                    </w:rPr>
-                    <w:t xml:space="preserve">▸ </w:t>
-                  </w:r>
-                  <w:r>
-                    <w:rPr>
-                      <w:color w:val="1A1A1A"/>
-                      <w:sz w:val="19"/>
-                      <w:szCs w:val="19"/>
-                    </w:rPr>
-                    <w:t xml:space="preserve">Installation de réseaux : VLAN, LAN, DNS, DHCP (Cisco Packet Tracer, PuTTY)</w:t>
-                  </w:r>
-                </w:p>
-                <w:p>
-                  <w:pPr>
-                    <w:spacing w:after="70" w:line="280"/>
-                    <w:ind w:left="160"/>
-                  </w:pPr>
-                  <w:r>
-                    <w:rPr>
-                      <w:color w:val="4A7B93"/>
-                      <w:sz w:val="19"/>
-                      <w:szCs w:val="19"/>
-                    </w:rPr>
-                    <w:t xml:space="preserve">▸ </w:t>
-                  </w:r>
-                  <w:r>
-                    <w:rPr>
-                      <w:color w:val="1A1A1A"/>
-                      <w:sz w:val="19"/>
-                      <w:szCs w:val="19"/>
-                    </w:rPr>
-                    <w:t xml:space="preserve">Compétences en programmation : Python, C, SQL/MySQL, CLI, JS/TS/PHP (VS Code)</w:t>
-                  </w:r>
-                </w:p>
-                <w:p>
-                  <w:pPr>
-                    <w:spacing w:after="70" w:line="280"/>
-                    <w:ind w:left="160"/>
-                  </w:pPr>
-                  <w:r>
-                    <w:rPr>
-                      <w:color w:val="4A7B93"/>
-                      <w:sz w:val="19"/>
-                      <w:szCs w:val="19"/>
-                    </w:rPr>
-                    <w:t xml:space="preserve">▸ </w:t>
-                  </w:r>
-                  <w:r>
-                    <w:rPr>
-                      <w:color w:val="1A1A1A"/>
-                      <w:sz w:val="19"/>
-                      <w:szCs w:val="19"/>
-                    </w:rPr>
-                    <w:t xml:space="preserve">Compétences en électronique : circuits, composants et systèmes embarqués (Node-RED, Arduino IDE)</w:t>
-                  </w:r>
-                </w:p>
-                <w:p>
-                  <w:pPr>
-                    <w:spacing w:after="70" w:line="280"/>
-                    <w:ind w:left="160"/>
-                  </w:pPr>
-                  <w:r>
-                    <w:rPr>
-                      <w:color w:val="4A7B93"/>
-                      <w:sz w:val="19"/>
-                      <w:szCs w:val="19"/>
-                    </w:rPr>
-                    <w:t xml:space="preserve">▸ </w:t>
-                  </w:r>
-                  <w:r>
-                    <w:rPr>
-                      <w:color w:val="1A1A1A"/>
-                      <w:sz w:val="19"/>
-                      <w:szCs w:val="19"/>
-                    </w:rPr>
-                    <w:t xml:space="preserve">Compétences bureautique / ticketing (Microsoft Office, Hubspot CRM)</w:t>
-                  </w:r>
-                </w:p>
-                <w:p>
-                  <w:pPr>
-                    <w:spacing w:after="160" w:line="280"/>
-                    <w:ind w:left="160"/>
-                  </w:pPr>
-                  <w:r>
-                    <w:rPr>
-                      <w:color w:val="4A7B93"/>
-                      <w:sz w:val="19"/>
-                      <w:szCs w:val="19"/>
-                    </w:rPr>
-                    <w:t xml:space="preserve">▸ </w:t>
-                  </w:r>
-                  <w:r>
-                    <w:rPr>
-                      <w:color w:val="1A1A1A"/>
-                      <w:sz w:val="19"/>
-                      <w:szCs w:val="19"/>
-                    </w:rPr>
-                    <w:t xml:space="preserve">Compétences DevOps / Déploiement CI/CD (Git, GitHub, Vercel)</w:t>
-                  </w:r>
-                </w:p>
-              </w:tc>
-            </w:tr>
-            <w:tr>
-              <w:tc>
-                <w:tcPr>
-                  <w:tcW w:type="dxa" w:w="380"/>
-                  <w:tcBorders>
-                    <w:top w:val="none" w:color="FFFFFF" w:sz="0"/>
-                    <w:left w:val="none" w:color="FFFFFF" w:sz="0"/>
-                    <w:bottom w:val="none" w:color="FFFFFF" w:sz="0"/>
-                    <w:right w:val="single" w:color="4D4D4D" w:sz="6"/>
-                  </w:tcBorders>
-                  <w:tcMar>
-                    <w:top w:type="dxa" w:w="40"/>
-                    <w:left w:type="dxa" w:w="40"/>
-                    <w:bottom w:type="dxa" w:w="0"/>
-                    <w:right w:type="dxa" w:w="0"/>
-                  </w:tcMar>
-                  <w:vAlign w:val="top"/>
-                </w:tcPr>
-                <w:p>
-                  <w:pPr>
-                    <w:ind w:right="-90"/>
-                    <w:jc w:val="right"/>
-                  </w:pPr>
-                  <w:r>
-                    <w:rPr>
-                      <w:color w:val="1A1A1A"/>
-                      <w:sz w:val="26"/>
-                      <w:szCs w:val="26"/>
-                    </w:rPr>
-                    <w:t xml:space="preserve">●</w:t>
-                  </w:r>
-                </w:p>
-              </w:tc>
-              <w:tc>
-                <w:tcPr>
-                  <w:tcW w:type="dxa" w:w="8126"/>
-                  <w:tcBorders>
-                    <w:top w:val="none" w:color="FFFFFF" w:sz="0"/>
-                    <w:left w:val="none" w:color="FFFFFF" w:sz="0"/>
-                    <w:bottom w:val="none" w:color="FFFFFF" w:sz="0"/>
-                    <w:right w:val="none" w:color="FFFFFF" w:sz="0"/>
-                  </w:tcBorders>
-                  <w:tcMar>
-                    <w:top w:type="dxa" w:w="0"/>
-                    <w:left w:type="dxa" w:w="220"/>
-                    <w:bottom w:type="dxa" w:w="280"/>
-                    <w:right w:type="dxa" w:w="300"/>
-                  </w:tcMar>
-                  <w:vAlign w:val="top"/>
-                </w:tcPr>
-                <w:p>
-                  <w:pPr>
-                    <w:spacing w:after="60" w:line="300"/>
-                  </w:pPr>
-                  <w:r>
-                    <w:rPr>
-                      <w:b/>
-                      <w:bCs/>
-                      <w:color w:val="1A1A1A"/>
-                      <w:sz w:val="22"/>
-                      <w:szCs w:val="22"/>
-                    </w:rPr>
-                    <w:t xml:space="preserve">BUT Sciences des Données — Réorientation</w:t>
-                  </w:r>
-                  <w:r>
-                    <w:rPr>
-                      <w:i/>
-                      <w:iCs/>
-                      <w:color w:val="999999"/>
-                      <w:sz w:val="19"/>
-                      <w:szCs w:val="19"/>
-                    </w:rPr>
-                    <w:t xml:space="preserve">   2023 – 2024</w:t>
-                  </w:r>
-                </w:p>
-                <w:p>
-                  <w:pPr>
-                    <w:spacing w:after="140"/>
-                  </w:pPr>
-                  <w:r>
-                    <w:rPr>
-                      <w:i/>
-                      <w:iCs/>
-                      <w:color w:val="4A7B93"/>
-                      <w:sz w:val="20"/>
-                      <w:szCs w:val="20"/>
-                    </w:rPr>
-                    <w:t xml:space="preserve">Université de Lille (59)</w:t>
-                  </w:r>
-                </w:p>
-                <w:p>
-                  <w:pPr>
-                    <w:spacing w:after="70" w:line="280"/>
-                    <w:ind w:left="160"/>
-                  </w:pPr>
-                  <w:r>
-                    <w:rPr>
-                      <w:color w:val="4A7B93"/>
-                      <w:sz w:val="19"/>
-                      <w:szCs w:val="19"/>
-                    </w:rPr>
-                    <w:t xml:space="preserve">▸ </w:t>
-                  </w:r>
-                  <w:r>
-                    <w:rPr>
-                      <w:color w:val="1A1A1A"/>
-                      <w:sz w:val="19"/>
-                      <w:szCs w:val="19"/>
-                    </w:rPr>
-                    <w:t xml:space="preserve">Statistiques et probabilités : application des lois de probabilités à l'analyse de données</w:t>
-                  </w:r>
-                </w:p>
-                <w:p>
-                  <w:pPr>
-                    <w:spacing w:after="160" w:line="280"/>
-                    <w:ind w:left="160"/>
-                  </w:pPr>
-                  <w:r>
-                    <w:rPr>
-                      <w:color w:val="4A7B93"/>
-                      <w:sz w:val="19"/>
-                      <w:szCs w:val="19"/>
-                    </w:rPr>
-                    <w:t xml:space="preserve">▸ </w:t>
-                  </w:r>
-                  <w:r>
-                    <w:rPr>
-                      <w:color w:val="1A1A1A"/>
-                      <w:sz w:val="19"/>
-                      <w:szCs w:val="19"/>
-                    </w:rPr>
-                    <w:t xml:space="preserve">Informatique décisionnelle : SGBD et reporting (Microsoft SQL Server / Power BI)</w:t>
-                  </w:r>
-                </w:p>
-              </w:tc>
-            </w:tr>
-            <w:tr>
-              <w:tc>
-                <w:tcPr>
-                  <w:tcW w:type="dxa" w:w="380"/>
-                  <w:tcBorders>
-                    <w:top w:val="none" w:color="FFFFFF" w:sz="0"/>
-                    <w:left w:val="none" w:color="FFFFFF" w:sz="0"/>
-                    <w:bottom w:val="none" w:color="FFFFFF" w:sz="0"/>
-                    <w:right w:val="single" w:color="4D4D4D" w:sz="6"/>
-                  </w:tcBorders>
-                  <w:tcMar>
-                    <w:top w:type="dxa" w:w="40"/>
-                    <w:left w:type="dxa" w:w="40"/>
-                    <w:bottom w:type="dxa" w:w="0"/>
-                    <w:right w:type="dxa" w:w="0"/>
-                  </w:tcMar>
-                  <w:vAlign w:val="top"/>
-                </w:tcPr>
-                <w:p>
-                  <w:pPr>
-                    <w:ind w:right="-90"/>
-                    <w:jc w:val="right"/>
-                  </w:pPr>
-                  <w:r>
-                    <w:rPr>
-                      <w:color w:val="1A1A1A"/>
-                      <w:sz w:val="26"/>
-                      <w:szCs w:val="26"/>
-                    </w:rPr>
-                    <w:t xml:space="preserve">●</w:t>
-                  </w:r>
-                </w:p>
-              </w:tc>
-              <w:tc>
-                <w:tcPr>
-                  <w:tcW w:type="dxa" w:w="8126"/>
-                  <w:tcBorders>
-                    <w:top w:val="none" w:color="FFFFFF" w:sz="0"/>
-                    <w:left w:val="none" w:color="FFFFFF" w:sz="0"/>
-                    <w:bottom w:val="none" w:color="FFFFFF" w:sz="0"/>
-                    <w:right w:val="none" w:color="FFFFFF" w:sz="0"/>
-                  </w:tcBorders>
-                  <w:tcMar>
-                    <w:top w:type="dxa" w:w="0"/>
-                    <w:left w:type="dxa" w:w="220"/>
-                    <w:bottom w:type="dxa" w:w="280"/>
-                    <w:right w:type="dxa" w:w="300"/>
-                  </w:tcMar>
-                  <w:vAlign w:val="top"/>
-                </w:tcPr>
-                <w:p>
-                  <w:pPr>
-                    <w:spacing w:after="60" w:line="300"/>
-                  </w:pPr>
-                  <w:r>
-                    <w:rPr>
-                      <w:b/>
-                      <w:bCs/>
-                      <w:color w:val="1A1A1A"/>
-                      <w:sz w:val="22"/>
-                      <w:szCs w:val="22"/>
-                    </w:rPr>
-                    <w:t xml:space="preserve">Baccalauréat Général — Spécialités Mathématiques &amp; NSI</w:t>
-                  </w:r>
-                  <w:r>
-                    <w:rPr>
-                      <w:i/>
-                      <w:iCs/>
-                      <w:color w:val="999999"/>
-                      <w:sz w:val="19"/>
-                      <w:szCs w:val="19"/>
-                    </w:rPr>
-                    <w:t xml:space="preserve">   2022 – 2023</w:t>
-                  </w:r>
-                </w:p>
-                <w:p>
-                  <w:pPr>
-                    <w:spacing w:after="140"/>
-                  </w:pPr>
-                  <w:r>
-                    <w:rPr>
-                      <w:i/>
-                      <w:iCs/>
-                      <w:color w:val="4A7B93"/>
-                      <w:sz w:val="20"/>
-                      <w:szCs w:val="20"/>
-                    </w:rPr>
-                    <w:t xml:space="preserve">Lycée Faidherbe, Lille (59) — Admis</w:t>
+                    <w:t xml:space="preserve">Rigoureux, autonome et dynamique, je mets à profit mes compétences en réseaux et en gestion informatique pour assurer le bon fonctionnement, le suivi et la maintenance des équipements d’un parc informatique.</w:t>
                   </w:r>
                 </w:p>
               </w:tc>
@@ -1123,19 +995,69 @@
           <w:p>
             <w:pPr>
               <w:pBdr>
-                <w:bottom w:val="single" w:color="1CA3D6" w:sz="4" w:space="4"/>
+                <w:bottom w:val="single" w:color="1F3F52" w:sz="4" w:space="4"/>
               </w:pBdr>
-              <w:spacing w:after="200" w:before="380"/>
-            </w:pPr>
+              <w:spacing w:after="200" w:before="120"/>
+            </w:pPr>
+            <w:r>
+              <w:rPr>
+                <w:position w:val="6"/>
+              </w:rPr>
+              <w:drawing>
+                <wp:inline distT="0" distB="0" distL="0" distR="55000">
+                  <wp:extent cx="165000" cy="165000"/>
+                  <wp:effectExtent t="0" r="0" b="0" l="0"/>
+                  <wp:docPr id="41" name="formation-icon" descr="formation-icon"/>
+                  <wp:cNvGraphicFramePr>
+                    <a:graphicFrameLocks xmlns:a="http://schemas.openxmlformats.org/drawingml/2006/main" noChangeAspect="1"/>
+                  </wp:cNvGraphicFramePr>
+                  <a:graphic xmlns:a="http://schemas.openxmlformats.org/drawingml/2006/main">
+                    <a:graphicData uri="http://schemas.openxmlformats.org/drawingml/2006/picture">
+                      <pic:pic xmlns:pic="http://schemas.openxmlformats.org/drawingml/2006/picture">
+                        <pic:nvPicPr>
+                          <pic:cNvPr id="41" name="formation-icon" descr="formation-icon"/>
+                          <pic:cNvPicPr>
+                            <a:picLocks noChangeAspect="1"/>
+                          </pic:cNvPicPr>
+                        </pic:nvPicPr>
+                        <pic:blipFill>
+                          <a:blip r:embed="rId16" cstate="none"/>
+                          <a:srcRect/>
+                          <a:stretch>
+                            <a:fillRect/>
+                          </a:stretch>
+                        </pic:blipFill>
+                        <pic:spPr bwMode="auto">
+                          <a:xfrm>
+                            <a:off x="0" y="0"/>
+                            <a:ext cx="165000" cy="165000"/>
+                          </a:xfrm>
+                          <a:prstGeom prst="rect">
+                            <a:avLst/>
+                          </a:prstGeom>
+                        </pic:spPr>
+                      </pic:pic>
+                    </a:graphicData>
+                  </a:graphic>
+                </wp:inline>
+              </w:drawing>
+            </w:r>
+            <w:r>
+              <w:rPr>
+                <w:sz w:val="26"/>
+                <w:szCs w:val="26"/>
+              </w:rPr>
+              <w:t xml:space="preserve"> </w:t>
+            </w:r>
             <w:r>
               <w:rPr>
                 <w:b/>
                 <w:bCs/>
-                <w:color w:val="1CA3D6"/>
+                <w:color w:val="1F3F52"/>
                 <w:sz w:val="26"/>
                 <w:szCs w:val="26"/>
               </w:rPr>
-              <w:t xml:space="preserve">EXPÉRIENCE PROFESSIONNELLE</w:t>
+              <w:t xml:space="preserve">FORMATION</w:t>
             </w:r>
           </w:p>
           <w:tbl>
@@ -1175,16 +1097,50 @@
                 </w:tcPr>
                 <w:p>
                   <w:pPr>
-                    <w:ind w:right="-90"/>
-                    <w:jc w:val="right"/>
-                  </w:pPr>
-                  <w:r>
-                    <w:rPr>
-                      <w:color w:val="1A1A1A"/>
-                      <w:sz w:val="26"/>
-                      <w:szCs w:val="26"/>
-                    </w:rPr>
-                    <w:t xml:space="preserve">●</w:t>
+                    <w:spacing w:after="0"/>
+                  </w:pPr>
+                  <w:r>
+                    <w:drawing>
+                      <wp:anchor distT="0" distB="0" distL="0" distR="0" simplePos="0" relativeHeight="251658241" behindDoc="0" locked="0" layoutInCell="1" allowOverlap="1">
+                        <wp:simplePos x="0" y="0"/>
+                        <wp:positionH relativeFrom="column">
+                          <wp:posOffset>173900</wp:posOffset>
+                        </wp:positionH>
+                        <wp:positionV relativeFrom="paragraph">
+                          <wp:posOffset>55000</wp:posOffset>
+                        </wp:positionV>
+                        <wp:extent cx="84000" cy="84000"/>
+                        <wp:effectExtent l="0" t="0" r="0" b="0"/>
+                        <wp:wrapNone/>
+                        <wp:docPr id="101" name="puce-1" descr="puce"/>
+                        <wp:cNvGraphicFramePr/>
+                        <a:graphic xmlns:a="http://schemas.openxmlformats.org/drawingml/2006/main">
+                          <a:graphicData uri="http://schemas.openxmlformats.org/drawingml/2006/picture">
+                            <pic:pic xmlns:pic="http://schemas.openxmlformats.org/drawingml/2006/picture">
+                              <pic:nvPicPr>
+                                <pic:cNvPr id="101" name="puce-1"/>
+                                <pic:cNvPicPr/>
+                              </pic:nvPicPr>
+                              <pic:blipFill>
+                                <a:blip r:embed="rId18"/>
+                                <a:stretch>
+                                  <a:fillRect/>
+                                </a:stretch>
+                              </pic:blipFill>
+                              <pic:spPr>
+                                <a:xfrm>
+                                  <a:off x="0" y="0"/>
+                                  <a:ext cx="84000" cy="84000"/>
+                                </a:xfrm>
+                                <a:prstGeom prst="rect">
+                                  <a:avLst/>
+                                </a:prstGeom>
+                              </pic:spPr>
+                            </pic:pic>
+                          </a:graphicData>
+                        </a:graphic>
+                      </wp:anchor>
+                    </w:drawing>
                   </w:r>
                 </w:p>
               </w:tc>
@@ -1217,7 +1173,9 @@
                       <w:sz w:val="22"/>
                       <w:szCs w:val="22"/>
                     </w:rPr>
-                    <w:t xml:space="preserve">Stage PFMP — Administration réseau &amp; cybersécurité</w:t>
+                    <w:t xml:space="preserve">BTS Cybersécurité informatique et Electronique</w:t>
+                    <w:br/>
+                    <w:t xml:space="preserve">Option B : Électronique et Réseaux</w:t>
                   </w:r>
                   <w:r>
                     <w:rPr>
@@ -1227,7 +1185,7 @@
                       <w:sz w:val="19"/>
                       <w:szCs w:val="19"/>
                     </w:rPr>
-                    <w:t xml:space="preserve">   19/05 – 28/06/2025 · 6 semaines</w:t>
+                    <w:t xml:space="preserve">   2024 – 2026</w:t>
                   </w:r>
                 </w:p>
                 <w:p>
@@ -1242,12 +1200,700 @@
                       <w:sz w:val="20"/>
                       <w:szCs w:val="20"/>
                     </w:rPr>
+                    <w:t xml:space="preserve">LGT Baggio, Lille (59)</w:t>
+                  </w:r>
+                </w:p>
+                <w:p>
+                  <w:pPr>
+                    <w:spacing w:after="40" w:line="235"/>
+                    <w:ind w:left="160"/>
+                  </w:pPr>
+                  <w:r>
+                    <w:rPr>
+                      <w:color w:val="4A7B93"/>
+                      <w:sz w:val="19"/>
+                      <w:szCs w:val="19"/>
+                    </w:rPr>
+                    <w:t xml:space="preserve">▸ </w:t>
+                  </w:r>
+                  <w:r>
+                    <w:rPr>
+                      <w:color w:val="1A1A1A"/>
+                      <w:sz w:val="19"/>
+                      <w:szCs w:val="19"/>
+                    </w:rPr>
+                    <w:t xml:space="preserve">Formation exigeant rigueur, méthode et respect des procédures</w:t>
+                  </w:r>
+                </w:p>
+                <w:p>
+                  <w:pPr>
+                    <w:spacing w:after="40" w:line="235"/>
+                    <w:ind w:left="160"/>
+                  </w:pPr>
+                  <w:r>
+                    <w:rPr>
+                      <w:color w:val="4A7B93"/>
+                      <w:sz w:val="19"/>
+                      <w:szCs w:val="19"/>
+                    </w:rPr>
+                    <w:t xml:space="preserve">▸ </w:t>
+                  </w:r>
+                  <w:r>
+                    <w:rPr>
+                      <w:color w:val="1A1A1A"/>
+                      <w:sz w:val="19"/>
+                      <w:szCs w:val="19"/>
+                    </w:rPr>
+                    <w:t xml:space="preserve">Développement de l'autonomie, du travail en équipe et de la capacité d'analyse</w:t>
+                  </w:r>
+                </w:p>
+                <w:p>
+                  <w:pPr>
+                    <w:spacing w:after="40" w:line="235"/>
+                    <w:ind w:left="160"/>
+                  </w:pPr>
+                  <w:r>
+                    <w:rPr>
+                      <w:color w:val="4A7B93"/>
+                      <w:sz w:val="19"/>
+                      <w:szCs w:val="19"/>
+                    </w:rPr>
+                    <w:t xml:space="preserve">▸ </w:t>
+                  </w:r>
+                  <w:r>
+                    <w:rPr>
+                      <w:color w:val="1A1A1A"/>
+                      <w:sz w:val="19"/>
+                      <w:szCs w:val="19"/>
+                    </w:rPr>
+                    <w:t xml:space="preserve">Compétences informatiques : systèmes et réseaux (Zabbix, Wireshark)</w:t>
+                  </w:r>
+                </w:p>
+                <w:p>
+                  <w:pPr>
+                    <w:spacing w:after="40" w:line="235"/>
+                    <w:ind w:left="160"/>
+                  </w:pPr>
+                  <w:r>
+                    <w:rPr>
+                      <w:color w:val="4A7B93"/>
+                      <w:sz w:val="19"/>
+                      <w:szCs w:val="19"/>
+                    </w:rPr>
+                    <w:t xml:space="preserve">▸ </w:t>
+                  </w:r>
+                  <w:r>
+                    <w:rPr>
+                      <w:color w:val="1A1A1A"/>
+                      <w:sz w:val="19"/>
+                      <w:szCs w:val="19"/>
+                    </w:rPr>
+                    <w:t xml:space="preserve">Installation de réseaux : VLAN, LAN, DNS, DHCP (Cisco Packet Tracer, PuTTY)</w:t>
+                  </w:r>
+                </w:p>
+                <w:p>
+                  <w:pPr>
+                    <w:spacing w:after="40" w:line="235"/>
+                    <w:ind w:left="160"/>
+                  </w:pPr>
+                  <w:r>
+                    <w:rPr>
+                      <w:color w:val="4A7B93"/>
+                      <w:sz w:val="19"/>
+                      <w:szCs w:val="19"/>
+                    </w:rPr>
+                    <w:t xml:space="preserve">▸ </w:t>
+                  </w:r>
+                  <w:r>
+                    <w:rPr>
+                      <w:color w:val="1A1A1A"/>
+                      <w:sz w:val="19"/>
+                      <w:szCs w:val="19"/>
+                    </w:rPr>
+                    <w:t xml:space="preserve">Compétences en programmation : Python, C, SQL/MySQL, CLI, JS/TS/PHP (VS Code)</w:t>
+                  </w:r>
+                </w:p>
+                <w:p>
+                  <w:pPr>
+                    <w:spacing w:after="40" w:line="235"/>
+                    <w:ind w:left="160"/>
+                  </w:pPr>
+                  <w:r>
+                    <w:rPr>
+                      <w:color w:val="4A7B93"/>
+                      <w:sz w:val="19"/>
+                      <w:szCs w:val="19"/>
+                    </w:rPr>
+                    <w:t xml:space="preserve">▸ </w:t>
+                  </w:r>
+                  <w:r>
+                    <w:rPr>
+                      <w:color w:val="1A1A1A"/>
+                      <w:sz w:val="19"/>
+                      <w:szCs w:val="19"/>
+                    </w:rPr>
+                    <w:t xml:space="preserve">Compétences en électronique : circuits, composants et systèmes embarqués</w:t>
+                    <w:br/>
+                    <w:t xml:space="preserve">(Node-RED, Arduino IDE)</w:t>
+                  </w:r>
+                </w:p>
+                <w:p>
+                  <w:pPr>
+                    <w:spacing w:after="40" w:line="235"/>
+                    <w:ind w:left="160"/>
+                  </w:pPr>
+                  <w:r>
+                    <w:rPr>
+                      <w:color w:val="4A7B93"/>
+                      <w:sz w:val="19"/>
+                      <w:szCs w:val="19"/>
+                    </w:rPr>
+                    <w:t xml:space="preserve">▸ </w:t>
+                  </w:r>
+                  <w:r>
+                    <w:rPr>
+                      <w:color w:val="1A1A1A"/>
+                      <w:sz w:val="19"/>
+                      <w:szCs w:val="19"/>
+                    </w:rPr>
+                    <w:t xml:space="preserve">Compétences bureautique / ticketing (Microsoft Office, Hubspot CRM)</w:t>
+                  </w:r>
+                </w:p>
+                <w:p>
+                  <w:pPr>
+                    <w:spacing w:after="90" w:line="235"/>
+                    <w:ind w:left="160"/>
+                  </w:pPr>
+                  <w:r>
+                    <w:rPr>
+                      <w:color w:val="4A7B93"/>
+                      <w:sz w:val="19"/>
+                      <w:szCs w:val="19"/>
+                    </w:rPr>
+                    <w:t xml:space="preserve">▸ </w:t>
+                  </w:r>
+                  <w:r>
+                    <w:rPr>
+                      <w:color w:val="1A1A1A"/>
+                      <w:sz w:val="19"/>
+                      <w:szCs w:val="19"/>
+                    </w:rPr>
+                    <w:t xml:space="preserve">Compétences DevOps / Déploiement CI/CD (Git, GitHub, Vercel)</w:t>
+                  </w:r>
+                </w:p>
+              </w:tc>
+            </w:tr>
+            <w:tr>
+              <w:tc>
+                <w:tcPr>
+                  <w:tcW w:type="dxa" w:w="380"/>
+                  <w:tcBorders>
+                    <w:top w:val="none" w:color="FFFFFF" w:sz="0"/>
+                    <w:left w:val="none" w:color="FFFFFF" w:sz="0"/>
+                    <w:bottom w:val="none" w:color="FFFFFF" w:sz="0"/>
+                    <w:right w:val="single" w:color="4D4D4D" w:sz="6"/>
+                  </w:tcBorders>
+                  <w:tcMar>
+                    <w:top w:type="dxa" w:w="40"/>
+                    <w:left w:type="dxa" w:w="40"/>
+                    <w:bottom w:type="dxa" w:w="0"/>
+                    <w:right w:type="dxa" w:w="0"/>
+                  </w:tcMar>
+                  <w:vAlign w:val="top"/>
+                </w:tcPr>
+                <w:p>
+                  <w:pPr>
+                    <w:spacing w:after="0"/>
+                  </w:pPr>
+                  <w:r>
+                    <w:drawing>
+                      <wp:anchor distT="0" distB="0" distL="0" distR="0" simplePos="0" relativeHeight="251658242" behindDoc="0" locked="0" layoutInCell="1" allowOverlap="1">
+                        <wp:simplePos x="0" y="0"/>
+                        <wp:positionH relativeFrom="column">
+                          <wp:posOffset>173900</wp:posOffset>
+                        </wp:positionH>
+                        <wp:positionV relativeFrom="paragraph">
+                          <wp:posOffset>55000</wp:posOffset>
+                        </wp:positionV>
+                        <wp:extent cx="84000" cy="84000"/>
+                        <wp:effectExtent l="0" t="0" r="0" b="0"/>
+                        <wp:wrapNone/>
+                        <wp:docPr id="102" name="puce-2" descr="puce"/>
+                        <wp:cNvGraphicFramePr/>
+                        <a:graphic xmlns:a="http://schemas.openxmlformats.org/drawingml/2006/main">
+                          <a:graphicData uri="http://schemas.openxmlformats.org/drawingml/2006/picture">
+                            <pic:pic xmlns:pic="http://schemas.openxmlformats.org/drawingml/2006/picture">
+                              <pic:nvPicPr>
+                                <pic:cNvPr id="102" name="puce-2"/>
+                                <pic:cNvPicPr/>
+                              </pic:nvPicPr>
+                              <pic:blipFill>
+                                <a:blip r:embed="rId18"/>
+                                <a:stretch>
+                                  <a:fillRect/>
+                                </a:stretch>
+                              </pic:blipFill>
+                              <pic:spPr>
+                                <a:xfrm>
+                                  <a:off x="0" y="0"/>
+                                  <a:ext cx="84000" cy="84000"/>
+                                </a:xfrm>
+                                <a:prstGeom prst="rect">
+                                  <a:avLst/>
+                                </a:prstGeom>
+                              </pic:spPr>
+                            </pic:pic>
+                          </a:graphicData>
+                        </a:graphic>
+                      </wp:anchor>
+                    </w:drawing>
+                  </w:r>
+                </w:p>
+              </w:tc>
+              <w:tc>
+                <w:tcPr>
+                  <w:tcW w:type="dxa" w:w="8126"/>
+                  <w:tcBorders>
+                    <w:top w:val="none" w:color="FFFFFF" w:sz="0"/>
+                    <w:left w:val="none" w:color="FFFFFF" w:sz="0"/>
+                    <w:bottom w:val="none" w:color="FFFFFF" w:sz="0"/>
+                    <w:right w:val="none" w:color="FFFFFF" w:sz="0"/>
+                  </w:tcBorders>
+                  <w:tcMar>
+                    <w:top w:type="dxa" w:w="0"/>
+                    <w:left w:type="dxa" w:w="220"/>
+                    <w:bottom w:type="dxa" w:w="280"/>
+                    <w:right w:type="dxa" w:w="300"/>
+                  </w:tcMar>
+                  <w:vAlign w:val="top"/>
+                </w:tcPr>
+                <w:p>
+                  <w:pPr>
+                    <w:spacing w:after="60" w:line="300"/>
+                  </w:pPr>
+                  <w:r>
+                    <w:rPr>
+                      <w:b/>
+                      <w:bCs/>
+                      <w:color w:val="1A1A1A"/>
+                      <w:sz w:val="22"/>
+                      <w:szCs w:val="22"/>
+                    </w:rPr>
+                    <w:t xml:space="preserve">BUT Sciences des Données — Réorientation</w:t>
+                  </w:r>
+                  <w:r>
+                    <w:rPr>
+                      <w:i/>
+                      <w:iCs/>
+                      <w:color w:val="999999"/>
+                      <w:sz w:val="19"/>
+                      <w:szCs w:val="19"/>
+                    </w:rPr>
+                    <w:t xml:space="preserve">   2023 – 2024</w:t>
+                  </w:r>
+                </w:p>
+                <w:p>
+                  <w:pPr>
+                    <w:spacing w:after="140"/>
+                  </w:pPr>
+                  <w:r>
+                    <w:rPr>
+                      <w:i/>
+                      <w:iCs/>
+                      <w:color w:val="4A7B93"/>
+                      <w:sz w:val="20"/>
+                      <w:szCs w:val="20"/>
+                    </w:rPr>
+                    <w:t xml:space="preserve">Université de Lille (59)</w:t>
+                  </w:r>
+                </w:p>
+                <w:p>
+                  <w:pPr>
+                    <w:spacing w:after="40" w:line="235"/>
+                    <w:ind w:left="160"/>
+                  </w:pPr>
+                  <w:r>
+                    <w:rPr>
+                      <w:color w:val="4A7B93"/>
+                      <w:sz w:val="19"/>
+                      <w:szCs w:val="19"/>
+                    </w:rPr>
+                    <w:t xml:space="preserve">▸ </w:t>
+                  </w:r>
+                  <w:r>
+                    <w:rPr>
+                      <w:color w:val="1A1A1A"/>
+                      <w:sz w:val="19"/>
+                      <w:szCs w:val="19"/>
+                    </w:rPr>
+                    <w:t xml:space="preserve">Statistiques et probabilités : application des lois de probabilités à l'analyse de données</w:t>
+                  </w:r>
+                </w:p>
+                <w:p>
+                  <w:pPr>
+                    <w:spacing w:after="90" w:line="235"/>
+                    <w:ind w:left="160"/>
+                  </w:pPr>
+                  <w:r>
+                    <w:rPr>
+                      <w:color w:val="4A7B93"/>
+                      <w:sz w:val="19"/>
+                      <w:szCs w:val="19"/>
+                    </w:rPr>
+                    <w:t xml:space="preserve">▸ </w:t>
+                  </w:r>
+                  <w:r>
+                    <w:rPr>
+                      <w:color w:val="1A1A1A"/>
+                      <w:sz w:val="19"/>
+                      <w:szCs w:val="19"/>
+                    </w:rPr>
+                    <w:t xml:space="preserve">Informatique décisionnelle : SGBD et reporting (Microsoft SQL Server / Power BI)</w:t>
+                  </w:r>
+                </w:p>
+              </w:tc>
+            </w:tr>
+            <w:tr>
+              <w:tc>
+                <w:tcPr>
+                  <w:tcW w:type="dxa" w:w="380"/>
+                  <w:tcBorders>
+                    <w:top w:val="none" w:color="FFFFFF" w:sz="0"/>
+                    <w:left w:val="none" w:color="FFFFFF" w:sz="0"/>
+                    <w:bottom w:val="none" w:color="FFFFFF" w:sz="0"/>
+                    <w:right w:val="single" w:color="4D4D4D" w:sz="6"/>
+                  </w:tcBorders>
+                  <w:tcMar>
+                    <w:top w:type="dxa" w:w="40"/>
+                    <w:left w:type="dxa" w:w="40"/>
+                    <w:bottom w:type="dxa" w:w="0"/>
+                    <w:right w:type="dxa" w:w="0"/>
+                  </w:tcMar>
+                  <w:vAlign w:val="top"/>
+                </w:tcPr>
+                <w:p>
+                  <w:pPr>
+                    <w:spacing w:after="0"/>
+                  </w:pPr>
+                  <w:r>
+                    <w:drawing>
+                      <wp:anchor distT="0" distB="0" distL="0" distR="0" simplePos="0" relativeHeight="251658243" behindDoc="0" locked="0" layoutInCell="1" allowOverlap="1">
+                        <wp:simplePos x="0" y="0"/>
+                        <wp:positionH relativeFrom="column">
+                          <wp:posOffset>173900</wp:posOffset>
+                        </wp:positionH>
+                        <wp:positionV relativeFrom="paragraph">
+                          <wp:posOffset>55000</wp:posOffset>
+                        </wp:positionV>
+                        <wp:extent cx="84000" cy="84000"/>
+                        <wp:effectExtent l="0" t="0" r="0" b="0"/>
+                        <wp:wrapNone/>
+                        <wp:docPr id="103" name="puce-3" descr="puce"/>
+                        <wp:cNvGraphicFramePr/>
+                        <a:graphic xmlns:a="http://schemas.openxmlformats.org/drawingml/2006/main">
+                          <a:graphicData uri="http://schemas.openxmlformats.org/drawingml/2006/picture">
+                            <pic:pic xmlns:pic="http://schemas.openxmlformats.org/drawingml/2006/picture">
+                              <pic:nvPicPr>
+                                <pic:cNvPr id="103" name="puce-3"/>
+                                <pic:cNvPicPr/>
+                              </pic:nvPicPr>
+                              <pic:blipFill>
+                                <a:blip r:embed="rId18"/>
+                                <a:stretch>
+                                  <a:fillRect/>
+                                </a:stretch>
+                              </pic:blipFill>
+                              <pic:spPr>
+                                <a:xfrm>
+                                  <a:off x="0" y="0"/>
+                                  <a:ext cx="84000" cy="84000"/>
+                                </a:xfrm>
+                                <a:prstGeom prst="rect">
+                                  <a:avLst/>
+                                </a:prstGeom>
+                              </pic:spPr>
+                            </pic:pic>
+                          </a:graphicData>
+                        </a:graphic>
+                      </wp:anchor>
+                    </w:drawing>
+                  </w:r>
+                </w:p>
+              </w:tc>
+              <w:tc>
+                <w:tcPr>
+                  <w:tcW w:type="dxa" w:w="8126"/>
+                  <w:tcBorders>
+                    <w:top w:val="none" w:color="FFFFFF" w:sz="0"/>
+                    <w:left w:val="none" w:color="FFFFFF" w:sz="0"/>
+                    <w:bottom w:val="none" w:color="FFFFFF" w:sz="0"/>
+                    <w:right w:val="none" w:color="FFFFFF" w:sz="0"/>
+                  </w:tcBorders>
+                  <w:tcMar>
+                    <w:top w:type="dxa" w:w="0"/>
+                    <w:left w:type="dxa" w:w="220"/>
+                    <w:bottom w:type="dxa" w:w="280"/>
+                    <w:right w:type="dxa" w:w="300"/>
+                  </w:tcMar>
+                  <w:vAlign w:val="top"/>
+                </w:tcPr>
+                <w:p>
+                  <w:pPr>
+                    <w:spacing w:after="60" w:line="300"/>
+                  </w:pPr>
+                  <w:r>
+                    <w:rPr>
+                      <w:b/>
+                      <w:bCs/>
+                      <w:color w:val="1A1A1A"/>
+                      <w:sz w:val="22"/>
+                      <w:szCs w:val="22"/>
+                    </w:rPr>
+                    <w:t xml:space="preserve">Baccalauréat Général — Spécialités Mathématiques &amp; NSI</w:t>
+                  </w:r>
+                  <w:r>
+                    <w:rPr>
+                      <w:i/>
+                      <w:iCs/>
+                      <w:color w:val="999999"/>
+                      <w:sz w:val="19"/>
+                      <w:szCs w:val="19"/>
+                    </w:rPr>
+                    <w:t xml:space="preserve">   2022 – 2023</w:t>
+                  </w:r>
+                </w:p>
+                <w:p>
+                  <w:pPr>
+                    <w:spacing w:after="140"/>
+                  </w:pPr>
+                  <w:r>
+                    <w:rPr>
+                      <w:i/>
+                      <w:iCs/>
+                      <w:color w:val="4A7B93"/>
+                      <w:sz w:val="20"/>
+                      <w:szCs w:val="20"/>
+                    </w:rPr>
+                    <w:t xml:space="preserve">Lycée Faidherbe, Lille (59) — Admis</w:t>
+                  </w:r>
+                </w:p>
+              </w:tc>
+            </w:tr>
+          </w:tbl>
+          <w:p>
+            <w:pPr>
+              <w:pBdr>
+                <w:bottom w:val="single" w:color="1F3F52" w:sz="4" w:space="4"/>
+              </w:pBdr>
+              <w:spacing w:after="200" w:before="120"/>
+            </w:pPr>
+            <w:r>
+              <w:rPr>
+                <w:position w:val="6"/>
+              </w:rPr>
+              <w:drawing>
+                <wp:inline distT="0" distB="0" distL="0" distR="55000">
+                  <wp:extent cx="165000" cy="165000"/>
+                  <wp:effectExtent t="0" r="0" b="0" l="0"/>
+                  <wp:docPr id="42" name="experience-icon" descr="experience-icon"/>
+                  <wp:cNvGraphicFramePr>
+                    <a:graphicFrameLocks xmlns:a="http://schemas.openxmlformats.org/drawingml/2006/main" noChangeAspect="1"/>
+                  </wp:cNvGraphicFramePr>
+                  <a:graphic xmlns:a="http://schemas.openxmlformats.org/drawingml/2006/main">
+                    <a:graphicData uri="http://schemas.openxmlformats.org/drawingml/2006/picture">
+                      <pic:pic xmlns:pic="http://schemas.openxmlformats.org/drawingml/2006/picture">
+                        <pic:nvPicPr>
+                          <pic:cNvPr id="42" name="experience-icon" descr="experience-icon"/>
+                          <pic:cNvPicPr>
+                            <a:picLocks noChangeAspect="1"/>
+                          </pic:cNvPicPr>
+                        </pic:nvPicPr>
+                        <pic:blipFill>
+                          <a:blip r:embed="rId17" cstate="none"/>
+                          <a:srcRect/>
+                          <a:stretch>
+                            <a:fillRect/>
+                          </a:stretch>
+                        </pic:blipFill>
+                        <pic:spPr bwMode="auto">
+                          <a:xfrm>
+                            <a:off x="0" y="0"/>
+                            <a:ext cx="165000" cy="165000"/>
+                          </a:xfrm>
+                          <a:prstGeom prst="rect">
+                            <a:avLst/>
+                          </a:prstGeom>
+                        </pic:spPr>
+                      </pic:pic>
+                    </a:graphicData>
+                  </a:graphic>
+                </wp:inline>
+              </w:drawing>
+            </w:r>
+            <w:r>
+              <w:rPr>
+                <w:sz w:val="26"/>
+                <w:szCs w:val="26"/>
+              </w:rPr>
+              <w:t xml:space="preserve"> </w:t>
+            </w:r>
+            <w:r>
+              <w:rPr>
+                <w:b/>
+                <w:bCs/>
+                <w:color w:val="1F3F52"/>
+                <w:sz w:val="26"/>
+                <w:szCs w:val="26"/>
+              </w:rPr>
+              <w:t xml:space="preserve">EXPÉRIENCE PROFESSIONNELLE</w:t>
+            </w:r>
+          </w:p>
+          <w:tbl>
+            <w:tblPr>
+              <w:tblW w:type="dxa" w:w="8506"/>
+              <w:tblBorders>
+                <w:top w:val="single" w:color="auto" w:sz="4"/>
+                <w:left w:val="single" w:color="auto" w:sz="4"/>
+                <w:bottom w:val="single" w:color="auto" w:sz="4"/>
+                <w:right w:val="single" w:color="auto" w:sz="4"/>
+                <w:insideH w:val="single" w:color="auto" w:sz="4"/>
+                <w:insideV w:val="single" w:color="auto" w:sz="4"/>
+              </w:tblBorders>
+              <w:tblLayout w:type="fixed"/>
+            </w:tblPr>
+            <w:tblGrid>
+              <w:gridCol w:w="380"/>
+              <w:gridCol w:w="8126"/>
+            </w:tblGrid>
+            <w:tr>
+              <w:tc>
+                <w:tcPr>
+                  <w:tcW w:type="dxa" w:w="380"/>
+                  <w:tcBorders>
+                    <w:top w:val="none" w:color="FFFFFF" w:sz="0"/>
+                    <w:left w:val="none" w:color="FFFFFF" w:sz="0"/>
+                    <w:bottom w:val="none" w:color="FFFFFF" w:sz="0"/>
+                    <w:right w:val="single" w:color="4D4D4D" w:sz="6"/>
+                  </w:tcBorders>
+                  <w:tcMar>
+                    <w:top w:type="dxa" w:w="40"/>
+                    <w:left w:type="dxa" w:w="40"/>
+                    <w:bottom w:type="dxa" w:w="0"/>
+                    <w:right w:type="dxa" w:w="0"/>
+                  </w:tcMar>
+                  <w:vAlign w:val="top"/>
+                </w:tcPr>
+                <w:p>
+                  <w:pPr>
+                    <w:spacing w:after="0"/>
+                  </w:pPr>
+                  <w:r>
+                    <w:drawing>
+                      <wp:anchor distT="0" distB="0" distL="0" distR="0" simplePos="0" relativeHeight="251658244" behindDoc="0" locked="0" layoutInCell="1" allowOverlap="1">
+                        <wp:simplePos x="0" y="0"/>
+                        <wp:positionH relativeFrom="column">
+                          <wp:posOffset>173900</wp:posOffset>
+                        </wp:positionH>
+                        <wp:positionV relativeFrom="paragraph">
+                          <wp:posOffset>55000</wp:posOffset>
+                        </wp:positionV>
+                        <wp:extent cx="84000" cy="84000"/>
+                        <wp:effectExtent l="0" t="0" r="0" b="0"/>
+                        <wp:wrapNone/>
+                        <wp:docPr id="104" name="puce-4" descr="puce"/>
+                        <wp:cNvGraphicFramePr/>
+                        <a:graphic xmlns:a="http://schemas.openxmlformats.org/drawingml/2006/main">
+                          <a:graphicData uri="http://schemas.openxmlformats.org/drawingml/2006/picture">
+                            <pic:pic xmlns:pic="http://schemas.openxmlformats.org/drawingml/2006/picture">
+                              <pic:nvPicPr>
+                                <pic:cNvPr id="104" name="puce-4"/>
+                                <pic:cNvPicPr/>
+                              </pic:nvPicPr>
+                              <pic:blipFill>
+                                <a:blip r:embed="rId18"/>
+                                <a:stretch>
+                                  <a:fillRect/>
+                                </a:stretch>
+                              </pic:blipFill>
+                              <pic:spPr>
+                                <a:xfrm>
+                                  <a:off x="0" y="0"/>
+                                  <a:ext cx="84000" cy="84000"/>
+                                </a:xfrm>
+                                <a:prstGeom prst="rect">
+                                  <a:avLst/>
+                                </a:prstGeom>
+                              </pic:spPr>
+                            </pic:pic>
+                          </a:graphicData>
+                        </a:graphic>
+                      </wp:anchor>
+                    </w:drawing>
+                  </w:r>
+                </w:p>
+              </w:tc>
+              <w:tc>
+                <w:tcPr>
+                  <w:tcW w:type="dxa" w:w="8126"/>
+                  <w:tcBorders>
+                    <w:top w:val="none" w:color="FFFFFF" w:sz="0"/>
+                    <w:left w:val="none" w:color="FFFFFF" w:sz="0"/>
+                    <w:bottom w:val="none" w:color="FFFFFF" w:sz="0"/>
+                    <w:right w:val="none" w:color="FFFFFF" w:sz="0"/>
+                  </w:tcBorders>
+                  <w:tcMar>
+                    <w:top w:type="dxa" w:w="0"/>
+                    <w:left w:type="dxa" w:w="220"/>
+                    <w:bottom w:type="dxa" w:w="280"/>
+                    <w:right w:type="dxa" w:w="300"/>
+                  </w:tcMar>
+                  <w:vAlign w:val="top"/>
+                </w:tcPr>
+                <w:p>
+                  <w:pPr>
+                    <w:spacing w:after="60" w:line="300"/>
+                  </w:pPr>
+                  <w:r>
+                    <w:rPr>
+                      <w:b/>
+                      <w:bCs/>
+                      <w:color w:val="1A1A1A"/>
+                      <w:sz w:val="22"/>
+                      <w:szCs w:val="22"/>
+                    </w:rPr>
+                    <w:t xml:space="preserve">Stage PFMP — Administration réseau &amp; cybersécurité</w:t>
+                  </w:r>
+                  <w:r>
+                    <w:rPr>
+                      <w:i/>
+                      <w:iCs/>
+                      <w:color w:val="999999"/>
+                      <w:sz w:val="19"/>
+                      <w:szCs w:val="19"/>
+                    </w:rPr>
+                    <w:t xml:space="preserve">   19/05 – 28/06/2025</w:t>
+                    <w:br/>
+                    <w:t xml:space="preserve">· 6 semaines</w:t>
+                  </w:r>
+                </w:p>
+                <w:p>
+                  <w:pPr>
+                    <w:spacing w:after="140"/>
+                  </w:pPr>
+                  <w:r>
+                    <w:rPr>
+                      <w:i/>
+                      <w:iCs/>
+                      <w:color w:val="4A7B93"/>
+                      <w:sz w:val="20"/>
+                      <w:szCs w:val="20"/>
+                    </w:rPr>
                     <w:t xml:space="preserve">Konica Minolta Business Solutions France — Sainghin-en-Mélantois (59)</w:t>
                   </w:r>
                 </w:p>
                 <w:p>
                   <w:pPr>
-                    <w:spacing w:after="70" w:line="280"/>
+                    <w:spacing w:after="40" w:line="235"/>
                     <w:ind w:left="160"/>
                   </w:pPr>
                   <w:r>
@@ -1264,12 +1910,14 @@
                       <w:sz w:val="19"/>
                       <w:szCs w:val="19"/>
                     </w:rPr>
-                    <w:t xml:space="preserve">Écoute et adaptation aux besoins spécifiques du client pour proposer des solutions adaptées à son environnement</w:t>
-                  </w:r>
-                </w:p>
-                <w:p>
-                  <w:pPr>
-                    <w:spacing w:after="70" w:line="280"/>
+                    <w:t xml:space="preserve">Écoute et adaptation aux besoins spécifiques du client pour proposer des solutions</w:t>
+                    <w:br/>
+                    <w:t xml:space="preserve">adaptées à son environnement</w:t>
+                  </w:r>
+                </w:p>
+                <w:p>
+                  <w:pPr>
+                    <w:spacing w:after="40" w:line="235"/>
                     <w:ind w:left="160"/>
                   </w:pPr>
                   <w:r>
@@ -1291,7 +1939,7 @@
                 </w:p>
                 <w:p>
                   <w:pPr>
-                    <w:spacing w:after="70" w:line="280"/>
+                    <w:spacing w:after="40" w:line="235"/>
                     <w:ind w:left="160"/>
                   </w:pPr>
                   <w:r>
@@ -1313,7 +1961,7 @@
                 </w:p>
                 <w:p>
                   <w:pPr>
-                    <w:spacing w:after="160" w:line="280"/>
+                    <w:spacing w:after="90" w:line="235"/>
                     <w:ind w:left="160"/>
                   </w:pPr>
                   <w:r>

</xml_diff>